<commit_message>
Show Pendidikan and Risiko on a shared 1–10 display scale
</commit_message>
<xml_diff>
--- a/docs/Metodologi-PKPRB.docx
+++ b/docs/Metodologi-PKPRB.docx
@@ -237,7 +237,7 @@
           <w:color w:val="1F1A16"/>
           <w:sz w:val="22"/>
         </w:rPr>
-        <w:t>Skala warna mutlak: risiko 0–100 (komposit 0–200), pendidikan 0–4 = ln(1+kapasitas), tanpa bagi penduduk. Jabar ≈ Yogya?</w:t>
+        <w:t>Skala tampilan 1–10 untuk Pendidikan dan Risiko (bukan min–maks 38 provinsi). Keselarasan tetap 3×3. Cukup intuitif?</w:t>
       </w:r>
     </w:p>
     <w:p>
@@ -308,7 +308,7 @@
           <w:color w:val="1F1A16"/>
           <w:sz w:val="22"/>
         </w:rPr>
-        <w:t xml:space="preserve"> — ln(1 + kapasitas), skala 0–4. Penduduk tidak dibagi. Per juta tetap di panel.</w:t>
+        <w:t xml:space="preserve"> — skala tampilan 1–10 dari ln(1 + kapasitas). Penduduk tidak dibagi. 1 = kapasitas nol; 10 = ln(1+kapasitas) ≥ 4.</w:t>
       </w:r>
     </w:p>
     <w:p>
@@ -334,7 +334,7 @@
           <w:color w:val="1F1A16"/>
           <w:sz w:val="22"/>
         </w:rPr>
-        <w:t xml:space="preserve"> — komposit bergaya IRBI atau satu jenis bahaya. Skala mutlak 0–100 (0–200 untuk komposit).</w:t>
+        <w:t xml:space="preserve"> — skala tampilan 1–10. Bahaya tunggal dari skor 0–100; komposit dari IRBI 0–200.</w:t>
       </w:r>
     </w:p>
     <w:p>
@@ -360,7 +360,7 @@
           <w:color w:val="1F1A16"/>
           <w:sz w:val="22"/>
         </w:rPr>
-        <w:t xml:space="preserve"> — matriks 3×3 tertil risiko × tertil pendidikan di antara 38 provinsi. Ini satu-satunya tampilan yang memang relatif antarprovinsi.</w:t>
+        <w:t xml:space="preserve"> — matriks 3×3 tertil risiko × tertil pendidikan di antara 38 provinsi. Tidak dipaksa jadi satu angka. Tooltip memakai kedua nilai 1–10.</w:t>
       </w:r>
     </w:p>
     <w:p>
@@ -4567,6 +4567,9 @@
               <w:t>IDPKI = ln(1 + Kapasitas)</w:t>
               <w:br/>
               <w:t>per_juta = Kapasitas / (jumlah penduduk / 1.000.000)   (panel, bukan warna peta)</w:t>
+              <w:br/>
+              <w:br/>
+              <w:t>Pendidikan_tampil = 1 + 9 × min(1, IDPKI / 4)</w:t>
             </w:r>
           </w:p>
         </w:tc>
@@ -4585,7 +4588,7 @@
           <w:color w:val="1F1A16"/>
           <w:sz w:val="22"/>
         </w:rPr>
-        <w:t>Peta Pendidikan mewarnai massa akademik, bukan kepadatan per kapita. ln meredam pencilan tanpa membuang urutan: Yogya ≈ Jabar (kapasitas ~24), Papua Selatan (satu S1) tetap rendah. Per juta dan kapasitas mentah tetap di panel provinsi. Tab Pendidikan: 0–4 mutlak.</w:t>
+        <w:t>Peta Pendidikan mewarnai massa akademik, bukan kepadatan per kapita. ln meredam pencilan tanpa membuang urutan: Yogya ≈ Jabar (kapasitas ~24 → sekitar 8 dari 10), Papua Selatan (satu S1 → sekitar 2). Per juta, kapasitas, dan skor bahaya mentah tetap di panel. Warna dan tooltip memakai skala 1–10.</w:t>
       </w:r>
     </w:p>
     <w:p>
@@ -4628,7 +4631,7 @@
           <w:color w:val="1F1A16"/>
           <w:sz w:val="22"/>
         </w:rPr>
-        <w:t>Warna Risiko: 0–100 untuk bahaya tunggal, 0–200 untuk komposit. Tidak distretch ke provinsi terendah–tertinggi.</w:t>
+        <w:t>Warna dan angka Risiko di peta: skala 1–10. Risiko_tampil = 1 + 9 × min(1, R / R_cap), R_cap = 100 untuk bahaya tunggal, 200 untuk komposit. Skor mentah IRBI tetap di panel. Tidak distretch ke provinsi terendah–tertinggi.</w:t>
       </w:r>
     </w:p>
     <w:p>

</xml_diff>

<commit_message>
Refresh methodology: 1–10 examples, drop IDPKI label
</commit_message>
<xml_diff>
--- a/docs/Metodologi-PKPRB.docx
+++ b/docs/Metodologi-PKPRB.docx
@@ -363,6 +363,793 @@
         <w:t xml:space="preserve"> — matriks 3×3 tertil risiko × tertil pendidikan di antara 38 provinsi. Tidak dipaksa jadi satu angka. Tooltip memakai kedua nilai 1–10.</w:t>
       </w:r>
     </w:p>
+    <w:p>
+      <w:pPr>
+        <w:spacing w:after="160" w:before="0" w:line="276" w:lineRule="auto"/>
+      </w:pPr>
+      <w:r>
+        <w:rPr>
+          <w:rFonts w:ascii="Calibri" w:hAnsi="Calibri" w:eastAsia="Calibri"/>
+          <w:b w:val="0"/>
+          <w:i w:val="0"/>
+          <w:color w:val="1F1A16"/>
+          <w:sz w:val="22"/>
+        </w:rPr>
+        <w:t>Contoh pada bahaya gempabumi, bobot default (dibulatkan):</w:t>
+      </w:r>
+    </w:p>
+    <w:tbl>
+      <w:tblPr>
+        <w:tblW w:type="auto" w:w="0"/>
+        <w:tblLayout w:type="autofit"/>
+        <w:tblLook w:firstColumn="1" w:firstRow="1" w:lastColumn="0" w:lastRow="0" w:noHBand="0" w:noVBand="1" w:val="04A0"/>
+      </w:tblPr>
+      <w:tblGrid>
+        <w:gridCol w:w="2353"/>
+        <w:gridCol w:w="2353"/>
+        <w:gridCol w:w="2353"/>
+        <w:gridCol w:w="2353"/>
+      </w:tblGrid>
+      <w:tr>
+        <w:tc>
+          <w:tcPr>
+            <w:tcW w:type="dxa" w:w="2353"/>
+            <w:shd w:fill="1F1A16" w:val="clear"/>
+            <w:tcBorders>
+              <w:top w:val="single" w:sz="4" w:space="0" w:color="1F1A16"/>
+              <w:left w:val="single" w:sz="4" w:space="0" w:color="1F1A16"/>
+              <w:bottom w:val="single" w:sz="4" w:space="0" w:color="1F1A16"/>
+              <w:right w:val="single" w:sz="4" w:space="0" w:color="1F1A16"/>
+            </w:tcBorders>
+          </w:tcPr>
+          <w:p>
+            <w:pPr>
+              <w:spacing w:after="0" w:before="0" w:line="276" w:lineRule="auto"/>
+            </w:pPr>
+            <w:r>
+              <w:rPr>
+                <w:rFonts w:ascii="Calibri" w:hAnsi="Calibri" w:eastAsia="Calibri"/>
+                <w:b/>
+                <w:i w:val="0"/>
+                <w:color w:val="F3EEE4"/>
+                <w:sz w:val="18"/>
+              </w:rPr>
+              <w:t>Provinsi</w:t>
+            </w:r>
+          </w:p>
+        </w:tc>
+        <w:tc>
+          <w:tcPr>
+            <w:tcW w:type="dxa" w:w="2353"/>
+            <w:shd w:fill="1F1A16" w:val="clear"/>
+            <w:tcBorders>
+              <w:top w:val="single" w:sz="4" w:space="0" w:color="1F1A16"/>
+              <w:left w:val="single" w:sz="4" w:space="0" w:color="1F1A16"/>
+              <w:bottom w:val="single" w:sz="4" w:space="0" w:color="1F1A16"/>
+              <w:right w:val="single" w:sz="4" w:space="0" w:color="1F1A16"/>
+            </w:tcBorders>
+          </w:tcPr>
+          <w:p>
+            <w:pPr>
+              <w:spacing w:after="0" w:before="0" w:line="276" w:lineRule="auto"/>
+            </w:pPr>
+            <w:r>
+              <w:rPr>
+                <w:rFonts w:ascii="Calibri" w:hAnsi="Calibri" w:eastAsia="Calibri"/>
+                <w:b/>
+                <w:i w:val="0"/>
+                <w:color w:val="F3EEE4"/>
+                <w:sz w:val="18"/>
+              </w:rPr>
+              <w:t>Pendidikan (1–10)</w:t>
+            </w:r>
+          </w:p>
+        </w:tc>
+        <w:tc>
+          <w:tcPr>
+            <w:tcW w:type="dxa" w:w="2353"/>
+            <w:shd w:fill="1F1A16" w:val="clear"/>
+            <w:tcBorders>
+              <w:top w:val="single" w:sz="4" w:space="0" w:color="1F1A16"/>
+              <w:left w:val="single" w:sz="4" w:space="0" w:color="1F1A16"/>
+              <w:bottom w:val="single" w:sz="4" w:space="0" w:color="1F1A16"/>
+              <w:right w:val="single" w:sz="4" w:space="0" w:color="1F1A16"/>
+            </w:tcBorders>
+          </w:tcPr>
+          <w:p>
+            <w:pPr>
+              <w:spacing w:after="0" w:before="0" w:line="276" w:lineRule="auto"/>
+            </w:pPr>
+            <w:r>
+              <w:rPr>
+                <w:rFonts w:ascii="Calibri" w:hAnsi="Calibri" w:eastAsia="Calibri"/>
+                <w:b/>
+                <w:i w:val="0"/>
+                <w:color w:val="F3EEE4"/>
+                <w:sz w:val="18"/>
+              </w:rPr>
+              <w:t>Risiko gempa (1–10)</w:t>
+            </w:r>
+          </w:p>
+        </w:tc>
+        <w:tc>
+          <w:tcPr>
+            <w:tcW w:type="dxa" w:w="2353"/>
+            <w:shd w:fill="1F1A16" w:val="clear"/>
+            <w:tcBorders>
+              <w:top w:val="single" w:sz="4" w:space="0" w:color="1F1A16"/>
+              <w:left w:val="single" w:sz="4" w:space="0" w:color="1F1A16"/>
+              <w:bottom w:val="single" w:sz="4" w:space="0" w:color="1F1A16"/>
+              <w:right w:val="single" w:sz="4" w:space="0" w:color="1F1A16"/>
+            </w:tcBorders>
+          </w:tcPr>
+          <w:p>
+            <w:pPr>
+              <w:spacing w:after="0" w:before="0" w:line="276" w:lineRule="auto"/>
+            </w:pPr>
+            <w:r>
+              <w:rPr>
+                <w:rFonts w:ascii="Calibri" w:hAnsi="Calibri" w:eastAsia="Calibri"/>
+                <w:b/>
+                <w:i w:val="0"/>
+                <w:color w:val="F3EEE4"/>
+                <w:sz w:val="18"/>
+              </w:rPr>
+              <w:t>Catatan</w:t>
+            </w:r>
+          </w:p>
+        </w:tc>
+      </w:tr>
+      <w:tr>
+        <w:tc>
+          <w:tcPr>
+            <w:tcW w:type="dxa" w:w="2353"/>
+            <w:tcBorders>
+              <w:top w:val="single" w:sz="4" w:space="0" w:color="D9D1C5"/>
+              <w:left w:val="single" w:sz="4" w:space="0" w:color="D9D1C5"/>
+              <w:bottom w:val="single" w:sz="4" w:space="0" w:color="D9D1C5"/>
+              <w:right w:val="single" w:sz="4" w:space="0" w:color="D9D1C5"/>
+            </w:tcBorders>
+          </w:tcPr>
+          <w:p>
+            <w:pPr>
+              <w:spacing w:after="0" w:before="0" w:line="276" w:lineRule="auto"/>
+            </w:pPr>
+            <w:r>
+              <w:rPr>
+                <w:rFonts w:ascii="Calibri" w:hAnsi="Calibri" w:eastAsia="Calibri"/>
+                <w:b w:val="0"/>
+                <w:i w:val="0"/>
+                <w:color w:val="1F1A16"/>
+                <w:sz w:val="18"/>
+              </w:rPr>
+              <w:t>DI Yogyakarta</w:t>
+            </w:r>
+          </w:p>
+        </w:tc>
+        <w:tc>
+          <w:tcPr>
+            <w:tcW w:type="dxa" w:w="2353"/>
+            <w:tcBorders>
+              <w:top w:val="single" w:sz="4" w:space="0" w:color="D9D1C5"/>
+              <w:left w:val="single" w:sz="4" w:space="0" w:color="D9D1C5"/>
+              <w:bottom w:val="single" w:sz="4" w:space="0" w:color="D9D1C5"/>
+              <w:right w:val="single" w:sz="4" w:space="0" w:color="D9D1C5"/>
+            </w:tcBorders>
+          </w:tcPr>
+          <w:p>
+            <w:pPr>
+              <w:spacing w:after="0" w:before="0" w:line="276" w:lineRule="auto"/>
+            </w:pPr>
+            <w:r>
+              <w:rPr>
+                <w:rFonts w:ascii="Calibri" w:hAnsi="Calibri" w:eastAsia="Calibri"/>
+                <w:b w:val="0"/>
+                <w:i w:val="0"/>
+                <w:color w:val="1F1A16"/>
+                <w:sz w:val="18"/>
+              </w:rPr>
+              <w:t>8,3</w:t>
+            </w:r>
+          </w:p>
+        </w:tc>
+        <w:tc>
+          <w:tcPr>
+            <w:tcW w:type="dxa" w:w="2353"/>
+            <w:tcBorders>
+              <w:top w:val="single" w:sz="4" w:space="0" w:color="D9D1C5"/>
+              <w:left w:val="single" w:sz="4" w:space="0" w:color="D9D1C5"/>
+              <w:bottom w:val="single" w:sz="4" w:space="0" w:color="D9D1C5"/>
+              <w:right w:val="single" w:sz="4" w:space="0" w:color="D9D1C5"/>
+            </w:tcBorders>
+          </w:tcPr>
+          <w:p>
+            <w:pPr>
+              <w:spacing w:after="0" w:before="0" w:line="276" w:lineRule="auto"/>
+            </w:pPr>
+            <w:r>
+              <w:rPr>
+                <w:rFonts w:ascii="Calibri" w:hAnsi="Calibri" w:eastAsia="Calibri"/>
+                <w:b w:val="0"/>
+                <w:i w:val="0"/>
+                <w:color w:val="1F1A16"/>
+                <w:sz w:val="18"/>
+              </w:rPr>
+              <w:t>8,6</w:t>
+            </w:r>
+          </w:p>
+        </w:tc>
+        <w:tc>
+          <w:tcPr>
+            <w:tcW w:type="dxa" w:w="2353"/>
+            <w:tcBorders>
+              <w:top w:val="single" w:sz="4" w:space="0" w:color="D9D1C5"/>
+              <w:left w:val="single" w:sz="4" w:space="0" w:color="D9D1C5"/>
+              <w:bottom w:val="single" w:sz="4" w:space="0" w:color="D9D1C5"/>
+              <w:right w:val="single" w:sz="4" w:space="0" w:color="D9D1C5"/>
+            </w:tcBorders>
+          </w:tcPr>
+          <w:p>
+            <w:pPr>
+              <w:spacing w:after="0" w:before="0" w:line="276" w:lineRule="auto"/>
+            </w:pPr>
+            <w:r>
+              <w:rPr>
+                <w:rFonts w:ascii="Calibri" w:hAnsi="Calibri" w:eastAsia="Calibri"/>
+                <w:b w:val="0"/>
+                <w:i w:val="0"/>
+                <w:color w:val="1F1A16"/>
+                <w:sz w:val="18"/>
+              </w:rPr>
+              <w:t>Kapasitas ~24; selaras</w:t>
+            </w:r>
+          </w:p>
+        </w:tc>
+      </w:tr>
+      <w:tr>
+        <w:tc>
+          <w:tcPr>
+            <w:tcW w:type="dxa" w:w="2353"/>
+            <w:shd w:fill="F7F3EC" w:val="clear"/>
+            <w:tcBorders>
+              <w:top w:val="single" w:sz="4" w:space="0" w:color="D9D1C5"/>
+              <w:left w:val="single" w:sz="4" w:space="0" w:color="D9D1C5"/>
+              <w:bottom w:val="single" w:sz="4" w:space="0" w:color="D9D1C5"/>
+              <w:right w:val="single" w:sz="4" w:space="0" w:color="D9D1C5"/>
+            </w:tcBorders>
+          </w:tcPr>
+          <w:p>
+            <w:pPr>
+              <w:spacing w:after="0" w:before="0" w:line="276" w:lineRule="auto"/>
+            </w:pPr>
+            <w:r>
+              <w:rPr>
+                <w:rFonts w:ascii="Calibri" w:hAnsi="Calibri" w:eastAsia="Calibri"/>
+                <w:b w:val="0"/>
+                <w:i w:val="0"/>
+                <w:color w:val="1F1A16"/>
+                <w:sz w:val="18"/>
+              </w:rPr>
+              <w:t>Jawa Barat</w:t>
+            </w:r>
+          </w:p>
+        </w:tc>
+        <w:tc>
+          <w:tcPr>
+            <w:tcW w:type="dxa" w:w="2353"/>
+            <w:shd w:fill="F7F3EC" w:val="clear"/>
+            <w:tcBorders>
+              <w:top w:val="single" w:sz="4" w:space="0" w:color="D9D1C5"/>
+              <w:left w:val="single" w:sz="4" w:space="0" w:color="D9D1C5"/>
+              <w:bottom w:val="single" w:sz="4" w:space="0" w:color="D9D1C5"/>
+              <w:right w:val="single" w:sz="4" w:space="0" w:color="D9D1C5"/>
+            </w:tcBorders>
+          </w:tcPr>
+          <w:p>
+            <w:pPr>
+              <w:spacing w:after="0" w:before="0" w:line="276" w:lineRule="auto"/>
+            </w:pPr>
+            <w:r>
+              <w:rPr>
+                <w:rFonts w:ascii="Calibri" w:hAnsi="Calibri" w:eastAsia="Calibri"/>
+                <w:b w:val="0"/>
+                <w:i w:val="0"/>
+                <w:color w:val="1F1A16"/>
+                <w:sz w:val="18"/>
+              </w:rPr>
+              <w:t>8,2</w:t>
+            </w:r>
+          </w:p>
+        </w:tc>
+        <w:tc>
+          <w:tcPr>
+            <w:tcW w:type="dxa" w:w="2353"/>
+            <w:shd w:fill="F7F3EC" w:val="clear"/>
+            <w:tcBorders>
+              <w:top w:val="single" w:sz="4" w:space="0" w:color="D9D1C5"/>
+              <w:left w:val="single" w:sz="4" w:space="0" w:color="D9D1C5"/>
+              <w:bottom w:val="single" w:sz="4" w:space="0" w:color="D9D1C5"/>
+              <w:right w:val="single" w:sz="4" w:space="0" w:color="D9D1C5"/>
+            </w:tcBorders>
+          </w:tcPr>
+          <w:p>
+            <w:pPr>
+              <w:spacing w:after="0" w:before="0" w:line="276" w:lineRule="auto"/>
+            </w:pPr>
+            <w:r>
+              <w:rPr>
+                <w:rFonts w:ascii="Calibri" w:hAnsi="Calibri" w:eastAsia="Calibri"/>
+                <w:b w:val="0"/>
+                <w:i w:val="0"/>
+                <w:color w:val="1F1A16"/>
+                <w:sz w:val="18"/>
+              </w:rPr>
+              <w:t>7,5</w:t>
+            </w:r>
+          </w:p>
+        </w:tc>
+        <w:tc>
+          <w:tcPr>
+            <w:tcW w:type="dxa" w:w="2353"/>
+            <w:shd w:fill="F7F3EC" w:val="clear"/>
+            <w:tcBorders>
+              <w:top w:val="single" w:sz="4" w:space="0" w:color="D9D1C5"/>
+              <w:left w:val="single" w:sz="4" w:space="0" w:color="D9D1C5"/>
+              <w:bottom w:val="single" w:sz="4" w:space="0" w:color="D9D1C5"/>
+              <w:right w:val="single" w:sz="4" w:space="0" w:color="D9D1C5"/>
+            </w:tcBorders>
+          </w:tcPr>
+          <w:p>
+            <w:pPr>
+              <w:spacing w:after="0" w:before="0" w:line="276" w:lineRule="auto"/>
+            </w:pPr>
+            <w:r>
+              <w:rPr>
+                <w:rFonts w:ascii="Calibri" w:hAnsi="Calibri" w:eastAsia="Calibri"/>
+                <w:b w:val="0"/>
+                <w:i w:val="0"/>
+                <w:color w:val="1F1A16"/>
+                <w:sz w:val="18"/>
+              </w:rPr>
+              <w:t>Kapasitas hampir sama dengan Yogya</w:t>
+            </w:r>
+          </w:p>
+        </w:tc>
+      </w:tr>
+      <w:tr>
+        <w:tc>
+          <w:tcPr>
+            <w:tcW w:type="dxa" w:w="2353"/>
+            <w:tcBorders>
+              <w:top w:val="single" w:sz="4" w:space="0" w:color="D9D1C5"/>
+              <w:left w:val="single" w:sz="4" w:space="0" w:color="D9D1C5"/>
+              <w:bottom w:val="single" w:sz="4" w:space="0" w:color="D9D1C5"/>
+              <w:right w:val="single" w:sz="4" w:space="0" w:color="D9D1C5"/>
+            </w:tcBorders>
+          </w:tcPr>
+          <w:p>
+            <w:pPr>
+              <w:spacing w:after="0" w:before="0" w:line="276" w:lineRule="auto"/>
+            </w:pPr>
+            <w:r>
+              <w:rPr>
+                <w:rFonts w:ascii="Calibri" w:hAnsi="Calibri" w:eastAsia="Calibri"/>
+                <w:b w:val="0"/>
+                <w:i w:val="0"/>
+                <w:color w:val="1F1A16"/>
+                <w:sz w:val="18"/>
+              </w:rPr>
+              <w:t>Aceh</w:t>
+            </w:r>
+          </w:p>
+        </w:tc>
+        <w:tc>
+          <w:tcPr>
+            <w:tcW w:type="dxa" w:w="2353"/>
+            <w:tcBorders>
+              <w:top w:val="single" w:sz="4" w:space="0" w:color="D9D1C5"/>
+              <w:left w:val="single" w:sz="4" w:space="0" w:color="D9D1C5"/>
+              <w:bottom w:val="single" w:sz="4" w:space="0" w:color="D9D1C5"/>
+              <w:right w:val="single" w:sz="4" w:space="0" w:color="D9D1C5"/>
+            </w:tcBorders>
+          </w:tcPr>
+          <w:p>
+            <w:pPr>
+              <w:spacing w:after="0" w:before="0" w:line="276" w:lineRule="auto"/>
+            </w:pPr>
+            <w:r>
+              <w:rPr>
+                <w:rFonts w:ascii="Calibri" w:hAnsi="Calibri" w:eastAsia="Calibri"/>
+                <w:b w:val="0"/>
+                <w:i w:val="0"/>
+                <w:color w:val="1F1A16"/>
+                <w:sz w:val="18"/>
+              </w:rPr>
+              <w:t>6,6</w:t>
+            </w:r>
+          </w:p>
+        </w:tc>
+        <w:tc>
+          <w:tcPr>
+            <w:tcW w:type="dxa" w:w="2353"/>
+            <w:tcBorders>
+              <w:top w:val="single" w:sz="4" w:space="0" w:color="D9D1C5"/>
+              <w:left w:val="single" w:sz="4" w:space="0" w:color="D9D1C5"/>
+              <w:bottom w:val="single" w:sz="4" w:space="0" w:color="D9D1C5"/>
+              <w:right w:val="single" w:sz="4" w:space="0" w:color="D9D1C5"/>
+            </w:tcBorders>
+          </w:tcPr>
+          <w:p>
+            <w:pPr>
+              <w:spacing w:after="0" w:before="0" w:line="276" w:lineRule="auto"/>
+            </w:pPr>
+            <w:r>
+              <w:rPr>
+                <w:rFonts w:ascii="Calibri" w:hAnsi="Calibri" w:eastAsia="Calibri"/>
+                <w:b w:val="0"/>
+                <w:i w:val="0"/>
+                <w:color w:val="1F1A16"/>
+                <w:sz w:val="18"/>
+              </w:rPr>
+              <w:t>9,1</w:t>
+            </w:r>
+          </w:p>
+        </w:tc>
+        <w:tc>
+          <w:tcPr>
+            <w:tcW w:type="dxa" w:w="2353"/>
+            <w:tcBorders>
+              <w:top w:val="single" w:sz="4" w:space="0" w:color="D9D1C5"/>
+              <w:left w:val="single" w:sz="4" w:space="0" w:color="D9D1C5"/>
+              <w:bottom w:val="single" w:sz="4" w:space="0" w:color="D9D1C5"/>
+              <w:right w:val="single" w:sz="4" w:space="0" w:color="D9D1C5"/>
+            </w:tcBorders>
+          </w:tcPr>
+          <w:p>
+            <w:pPr>
+              <w:spacing w:after="0" w:before="0" w:line="276" w:lineRule="auto"/>
+            </w:pPr>
+            <w:r>
+              <w:rPr>
+                <w:rFonts w:ascii="Calibri" w:hAnsi="Calibri" w:eastAsia="Calibri"/>
+                <w:b w:val="0"/>
+                <w:i w:val="0"/>
+                <w:color w:val="1F1A16"/>
+                <w:sz w:val="18"/>
+              </w:rPr>
+              <w:t>TDMRC + banyak prodi</w:t>
+            </w:r>
+          </w:p>
+        </w:tc>
+      </w:tr>
+      <w:tr>
+        <w:tc>
+          <w:tcPr>
+            <w:tcW w:type="dxa" w:w="2353"/>
+            <w:shd w:fill="F7F3EC" w:val="clear"/>
+            <w:tcBorders>
+              <w:top w:val="single" w:sz="4" w:space="0" w:color="D9D1C5"/>
+              <w:left w:val="single" w:sz="4" w:space="0" w:color="D9D1C5"/>
+              <w:bottom w:val="single" w:sz="4" w:space="0" w:color="D9D1C5"/>
+              <w:right w:val="single" w:sz="4" w:space="0" w:color="D9D1C5"/>
+            </w:tcBorders>
+          </w:tcPr>
+          <w:p>
+            <w:pPr>
+              <w:spacing w:after="0" w:before="0" w:line="276" w:lineRule="auto"/>
+            </w:pPr>
+            <w:r>
+              <w:rPr>
+                <w:rFonts w:ascii="Calibri" w:hAnsi="Calibri" w:eastAsia="Calibri"/>
+                <w:b w:val="0"/>
+                <w:i w:val="0"/>
+                <w:color w:val="1F1A16"/>
+                <w:sz w:val="18"/>
+              </w:rPr>
+              <w:t>Papua</w:t>
+            </w:r>
+          </w:p>
+        </w:tc>
+        <w:tc>
+          <w:tcPr>
+            <w:tcW w:type="dxa" w:w="2353"/>
+            <w:shd w:fill="F7F3EC" w:val="clear"/>
+            <w:tcBorders>
+              <w:top w:val="single" w:sz="4" w:space="0" w:color="D9D1C5"/>
+              <w:left w:val="single" w:sz="4" w:space="0" w:color="D9D1C5"/>
+              <w:bottom w:val="single" w:sz="4" w:space="0" w:color="D9D1C5"/>
+              <w:right w:val="single" w:sz="4" w:space="0" w:color="D9D1C5"/>
+            </w:tcBorders>
+          </w:tcPr>
+          <w:p>
+            <w:pPr>
+              <w:spacing w:after="0" w:before="0" w:line="276" w:lineRule="auto"/>
+            </w:pPr>
+            <w:r>
+              <w:rPr>
+                <w:rFonts w:ascii="Calibri" w:hAnsi="Calibri" w:eastAsia="Calibri"/>
+                <w:b w:val="0"/>
+                <w:i w:val="0"/>
+                <w:color w:val="1F1A16"/>
+                <w:sz w:val="18"/>
+              </w:rPr>
+              <w:t>3,3</w:t>
+            </w:r>
+          </w:p>
+        </w:tc>
+        <w:tc>
+          <w:tcPr>
+            <w:tcW w:type="dxa" w:w="2353"/>
+            <w:shd w:fill="F7F3EC" w:val="clear"/>
+            <w:tcBorders>
+              <w:top w:val="single" w:sz="4" w:space="0" w:color="D9D1C5"/>
+              <w:left w:val="single" w:sz="4" w:space="0" w:color="D9D1C5"/>
+              <w:bottom w:val="single" w:sz="4" w:space="0" w:color="D9D1C5"/>
+              <w:right w:val="single" w:sz="4" w:space="0" w:color="D9D1C5"/>
+            </w:tcBorders>
+          </w:tcPr>
+          <w:p>
+            <w:pPr>
+              <w:spacing w:after="0" w:before="0" w:line="276" w:lineRule="auto"/>
+            </w:pPr>
+            <w:r>
+              <w:rPr>
+                <w:rFonts w:ascii="Calibri" w:hAnsi="Calibri" w:eastAsia="Calibri"/>
+                <w:b w:val="0"/>
+                <w:i w:val="0"/>
+                <w:color w:val="1F1A16"/>
+                <w:sz w:val="18"/>
+              </w:rPr>
+              <w:t>7,8</w:t>
+            </w:r>
+          </w:p>
+        </w:tc>
+        <w:tc>
+          <w:tcPr>
+            <w:tcW w:type="dxa" w:w="2353"/>
+            <w:shd w:fill="F7F3EC" w:val="clear"/>
+            <w:tcBorders>
+              <w:top w:val="single" w:sz="4" w:space="0" w:color="D9D1C5"/>
+              <w:left w:val="single" w:sz="4" w:space="0" w:color="D9D1C5"/>
+              <w:bottom w:val="single" w:sz="4" w:space="0" w:color="D9D1C5"/>
+              <w:right w:val="single" w:sz="4" w:space="0" w:color="D9D1C5"/>
+            </w:tcBorders>
+          </w:tcPr>
+          <w:p>
+            <w:pPr>
+              <w:spacing w:after="0" w:before="0" w:line="276" w:lineRule="auto"/>
+            </w:pPr>
+            <w:r>
+              <w:rPr>
+                <w:rFonts w:ascii="Calibri" w:hAnsi="Calibri" w:eastAsia="Calibri"/>
+                <w:b w:val="0"/>
+                <w:i w:val="0"/>
+                <w:color w:val="1F1A16"/>
+                <w:sz w:val="18"/>
+              </w:rPr>
+              <w:t>Sedikit prodi</w:t>
+            </w:r>
+          </w:p>
+        </w:tc>
+      </w:tr>
+      <w:tr>
+        <w:tc>
+          <w:tcPr>
+            <w:tcW w:type="dxa" w:w="2353"/>
+            <w:tcBorders>
+              <w:top w:val="single" w:sz="4" w:space="0" w:color="D9D1C5"/>
+              <w:left w:val="single" w:sz="4" w:space="0" w:color="D9D1C5"/>
+              <w:bottom w:val="single" w:sz="4" w:space="0" w:color="D9D1C5"/>
+              <w:right w:val="single" w:sz="4" w:space="0" w:color="D9D1C5"/>
+            </w:tcBorders>
+          </w:tcPr>
+          <w:p>
+            <w:pPr>
+              <w:spacing w:after="0" w:before="0" w:line="276" w:lineRule="auto"/>
+            </w:pPr>
+            <w:r>
+              <w:rPr>
+                <w:rFonts w:ascii="Calibri" w:hAnsi="Calibri" w:eastAsia="Calibri"/>
+                <w:b w:val="0"/>
+                <w:i w:val="0"/>
+                <w:color w:val="1F1A16"/>
+                <w:sz w:val="18"/>
+              </w:rPr>
+              <w:t>Papua Selatan</w:t>
+            </w:r>
+          </w:p>
+        </w:tc>
+        <w:tc>
+          <w:tcPr>
+            <w:tcW w:type="dxa" w:w="2353"/>
+            <w:tcBorders>
+              <w:top w:val="single" w:sz="4" w:space="0" w:color="D9D1C5"/>
+              <w:left w:val="single" w:sz="4" w:space="0" w:color="D9D1C5"/>
+              <w:bottom w:val="single" w:sz="4" w:space="0" w:color="D9D1C5"/>
+              <w:right w:val="single" w:sz="4" w:space="0" w:color="D9D1C5"/>
+            </w:tcBorders>
+          </w:tcPr>
+          <w:p>
+            <w:pPr>
+              <w:spacing w:after="0" w:before="0" w:line="276" w:lineRule="auto"/>
+            </w:pPr>
+            <w:r>
+              <w:rPr>
+                <w:rFonts w:ascii="Calibri" w:hAnsi="Calibri" w:eastAsia="Calibri"/>
+                <w:b w:val="0"/>
+                <w:i w:val="0"/>
+                <w:color w:val="1F1A16"/>
+                <w:sz w:val="18"/>
+              </w:rPr>
+              <w:t>2,5</w:t>
+            </w:r>
+          </w:p>
+        </w:tc>
+        <w:tc>
+          <w:tcPr>
+            <w:tcW w:type="dxa" w:w="2353"/>
+            <w:tcBorders>
+              <w:top w:val="single" w:sz="4" w:space="0" w:color="D9D1C5"/>
+              <w:left w:val="single" w:sz="4" w:space="0" w:color="D9D1C5"/>
+              <w:bottom w:val="single" w:sz="4" w:space="0" w:color="D9D1C5"/>
+              <w:right w:val="single" w:sz="4" w:space="0" w:color="D9D1C5"/>
+            </w:tcBorders>
+          </w:tcPr>
+          <w:p>
+            <w:pPr>
+              <w:spacing w:after="0" w:before="0" w:line="276" w:lineRule="auto"/>
+            </w:pPr>
+            <w:r>
+              <w:rPr>
+                <w:rFonts w:ascii="Calibri" w:hAnsi="Calibri" w:eastAsia="Calibri"/>
+                <w:b w:val="0"/>
+                <w:i w:val="0"/>
+                <w:color w:val="1F1A16"/>
+                <w:sz w:val="18"/>
+              </w:rPr>
+              <w:t>6,0</w:t>
+            </w:r>
+          </w:p>
+        </w:tc>
+        <w:tc>
+          <w:tcPr>
+            <w:tcW w:type="dxa" w:w="2353"/>
+            <w:tcBorders>
+              <w:top w:val="single" w:sz="4" w:space="0" w:color="D9D1C5"/>
+              <w:left w:val="single" w:sz="4" w:space="0" w:color="D9D1C5"/>
+              <w:bottom w:val="single" w:sz="4" w:space="0" w:color="D9D1C5"/>
+              <w:right w:val="single" w:sz="4" w:space="0" w:color="D9D1C5"/>
+            </w:tcBorders>
+          </w:tcPr>
+          <w:p>
+            <w:pPr>
+              <w:spacing w:after="0" w:before="0" w:line="276" w:lineRule="auto"/>
+            </w:pPr>
+            <w:r>
+              <w:rPr>
+                <w:rFonts w:ascii="Calibri" w:hAnsi="Calibri" w:eastAsia="Calibri"/>
+                <w:b w:val="0"/>
+                <w:i w:val="0"/>
+                <w:color w:val="1F1A16"/>
+                <w:sz w:val="18"/>
+              </w:rPr>
+              <w:t>Satu S1 Musamus</w:t>
+            </w:r>
+          </w:p>
+        </w:tc>
+      </w:tr>
+      <w:tr>
+        <w:tc>
+          <w:tcPr>
+            <w:tcW w:type="dxa" w:w="2353"/>
+            <w:shd w:fill="F7F3EC" w:val="clear"/>
+            <w:tcBorders>
+              <w:top w:val="single" w:sz="4" w:space="0" w:color="D9D1C5"/>
+              <w:left w:val="single" w:sz="4" w:space="0" w:color="D9D1C5"/>
+              <w:bottom w:val="single" w:sz="4" w:space="0" w:color="D9D1C5"/>
+              <w:right w:val="single" w:sz="4" w:space="0" w:color="D9D1C5"/>
+            </w:tcBorders>
+          </w:tcPr>
+          <w:p>
+            <w:pPr>
+              <w:spacing w:after="0" w:before="0" w:line="276" w:lineRule="auto"/>
+            </w:pPr>
+            <w:r>
+              <w:rPr>
+                <w:rFonts w:ascii="Calibri" w:hAnsi="Calibri" w:eastAsia="Calibri"/>
+                <w:b w:val="0"/>
+                <w:i w:val="0"/>
+                <w:color w:val="1F1A16"/>
+                <w:sz w:val="18"/>
+              </w:rPr>
+              <w:t>Maluku</w:t>
+            </w:r>
+          </w:p>
+        </w:tc>
+        <w:tc>
+          <w:tcPr>
+            <w:tcW w:type="dxa" w:w="2353"/>
+            <w:shd w:fill="F7F3EC" w:val="clear"/>
+            <w:tcBorders>
+              <w:top w:val="single" w:sz="4" w:space="0" w:color="D9D1C5"/>
+              <w:left w:val="single" w:sz="4" w:space="0" w:color="D9D1C5"/>
+              <w:bottom w:val="single" w:sz="4" w:space="0" w:color="D9D1C5"/>
+              <w:right w:val="single" w:sz="4" w:space="0" w:color="D9D1C5"/>
+            </w:tcBorders>
+          </w:tcPr>
+          <w:p>
+            <w:pPr>
+              <w:spacing w:after="0" w:before="0" w:line="276" w:lineRule="auto"/>
+            </w:pPr>
+            <w:r>
+              <w:rPr>
+                <w:rFonts w:ascii="Calibri" w:hAnsi="Calibri" w:eastAsia="Calibri"/>
+                <w:b w:val="0"/>
+                <w:i w:val="0"/>
+                <w:color w:val="1F1A16"/>
+                <w:sz w:val="18"/>
+              </w:rPr>
+              <w:t>2,7</w:t>
+            </w:r>
+          </w:p>
+        </w:tc>
+        <w:tc>
+          <w:tcPr>
+            <w:tcW w:type="dxa" w:w="2353"/>
+            <w:shd w:fill="F7F3EC" w:val="clear"/>
+            <w:tcBorders>
+              <w:top w:val="single" w:sz="4" w:space="0" w:color="D9D1C5"/>
+              <w:left w:val="single" w:sz="4" w:space="0" w:color="D9D1C5"/>
+              <w:bottom w:val="single" w:sz="4" w:space="0" w:color="D9D1C5"/>
+              <w:right w:val="single" w:sz="4" w:space="0" w:color="D9D1C5"/>
+            </w:tcBorders>
+          </w:tcPr>
+          <w:p>
+            <w:pPr>
+              <w:spacing w:after="0" w:before="0" w:line="276" w:lineRule="auto"/>
+            </w:pPr>
+            <w:r>
+              <w:rPr>
+                <w:rFonts w:ascii="Calibri" w:hAnsi="Calibri" w:eastAsia="Calibri"/>
+                <w:b w:val="0"/>
+                <w:i w:val="0"/>
+                <w:color w:val="1F1A16"/>
+                <w:sz w:val="18"/>
+              </w:rPr>
+              <w:t>8,9</w:t>
+            </w:r>
+          </w:p>
+        </w:tc>
+        <w:tc>
+          <w:tcPr>
+            <w:tcW w:type="dxa" w:w="2353"/>
+            <w:shd w:fill="F7F3EC" w:val="clear"/>
+            <w:tcBorders>
+              <w:top w:val="single" w:sz="4" w:space="0" w:color="D9D1C5"/>
+              <w:left w:val="single" w:sz="4" w:space="0" w:color="D9D1C5"/>
+              <w:bottom w:val="single" w:sz="4" w:space="0" w:color="D9D1C5"/>
+              <w:right w:val="single" w:sz="4" w:space="0" w:color="D9D1C5"/>
+            </w:tcBorders>
+          </w:tcPr>
+          <w:p>
+            <w:pPr>
+              <w:spacing w:after="0" w:before="0" w:line="276" w:lineRule="auto"/>
+            </w:pPr>
+            <w:r>
+              <w:rPr>
+                <w:rFonts w:ascii="Calibri" w:hAnsi="Calibri" w:eastAsia="Calibri"/>
+                <w:b w:val="0"/>
+                <w:i w:val="0"/>
+                <w:color w:val="1F1A16"/>
+                <w:sz w:val="18"/>
+              </w:rPr>
+              <w:t>Risiko tinggi, pendidikan rendah</w:t>
+            </w:r>
+          </w:p>
+        </w:tc>
+      </w:tr>
+    </w:tbl>
+    <w:p/>
     <w:p>
       <w:pPr>
         <w:pStyle w:val="Heading1"/>
@@ -4523,7 +5310,7 @@
           <w:rFonts w:ascii="Cambria" w:hAnsi="Cambria" w:eastAsia="Cambria"/>
           <w:color w:val="1F1A16"/>
         </w:rPr>
-        <w:t>6. Kapasitas dan IDPKI</w:t>
+        <w:t>6. Kapasitas dan indeks Pendidikan</w:t>
       </w:r>
     </w:p>
     <w:tbl>
@@ -4564,12 +5351,12 @@
               <w:t xml:space="preserve">            + spillover masuk (kolam sumber ÷ jumlah penerima)</w:t>
               <w:br/>
               <w:br/>
-              <w:t>IDPKI = ln(1 + Kapasitas)</w:t>
+              <w:t>P_ln = ln(1 + Kapasitas)</w:t>
               <w:br/>
               <w:t>per_juta = Kapasitas / (jumlah penduduk / 1.000.000)   (panel, bukan warna peta)</w:t>
               <w:br/>
               <w:br/>
-              <w:t>Pendidikan_tampil = 1 + 9 × min(1, IDPKI / 4)</w:t>
+              <w:t>Pendidikan_tampil = 1 + 9 × min(1, P_ln / 4)</w:t>
             </w:r>
           </w:p>
         </w:tc>
@@ -4631,9 +5418,53 @@
           <w:color w:val="1F1A16"/>
           <w:sz w:val="22"/>
         </w:rPr>
-        <w:t>Warna dan angka Risiko di peta: skala 1–10. Risiko_tampil = 1 + 9 × min(1, R / R_cap), R_cap = 100 untuk bahaya tunggal, 200 untuk komposit. Skor mentah IRBI tetap di panel. Tidak distretch ke provinsi terendah–tertinggi.</w:t>
+        <w:t>Warna dan angka Risiko di peta memakai skala 1–10. Skor mentah IRBI tetap di panel.</w:t>
       </w:r>
     </w:p>
+    <w:tbl>
+      <w:tblPr>
+        <w:tblW w:type="auto" w:w="0"/>
+        <w:tblLayout w:type="autofit"/>
+        <w:tblLook w:firstColumn="1" w:firstRow="1" w:lastColumn="0" w:lastRow="0" w:noHBand="0" w:noVBand="1" w:val="04A0"/>
+      </w:tblPr>
+      <w:tblGrid>
+        <w:gridCol w:w="9412"/>
+      </w:tblGrid>
+      <w:tr>
+        <w:tc>
+          <w:tcPr>
+            <w:tcW w:type="dxa" w:w="9412"/>
+            <w:shd w:fill="EDE7DC" w:val="clear"/>
+            <w:tcBorders>
+              <w:top w:val="single" w:sz="4" w:space="0" w:color="C9C0B3"/>
+              <w:left w:val="single" w:sz="4" w:space="0" w:color="C9C0B3"/>
+              <w:bottom w:val="single" w:sz="4" w:space="0" w:color="C9C0B3"/>
+              <w:right w:val="single" w:sz="4" w:space="0" w:color="C9C0B3"/>
+            </w:tcBorders>
+          </w:tcPr>
+          <w:p>
+            <w:pPr>
+              <w:spacing w:after="0" w:before="0" w:line="276" w:lineRule="auto"/>
+            </w:pPr>
+            <w:r>
+              <w:rPr>
+                <w:rFonts w:ascii="Consolas" w:hAnsi="Consolas" w:eastAsia="Consolas"/>
+                <w:b w:val="0"/>
+                <w:i w:val="0"/>
+                <w:color w:val="1F1A16"/>
+                <w:sz w:val="20"/>
+              </w:rPr>
+              <w:t>Risiko_tampil = 1 + 9 × min(1, R / R_cap)</w:t>
+              <w:br/>
+              <w:t>R_cap = 100  (bahaya tunggal)</w:t>
+              <w:br/>
+              <w:t xml:space="preserve">      = 200  (komposit)</w:t>
+            </w:r>
+          </w:p>
+        </w:tc>
+      </w:tr>
+    </w:tbl>
+    <w:p/>
     <w:p>
       <w:pPr>
         <w:pStyle w:val="Heading1"/>
@@ -5408,7 +6239,7 @@
           <w:color w:val="1F1A16"/>
           <w:sz w:val="22"/>
         </w:rPr>
-        <w:t>Footer peta mengurutkan enam provinsi dengan senjang terbesar. Untuk ranking ini, risiko dan IDPKI dinormalisasi min–maks 38 provinsi ke 0–1:</w:t>
+        <w:t>Footer peta mengurutkan enam provinsi dengan senjang terbesar. Untuk ranking ini, risiko dan pendidikan (nilai internal: skor bahaya dan P_ln) dinormalisasi min–maks 38 provinsi ke 0–1. Skala 1–10 monoton terhadap nilai itu, jadi urutan sama.</w:t>
       </w:r>
     </w:p>
     <w:tbl>
@@ -5446,10 +6277,10 @@
               </w:rPr>
               <w:t>risiko_norm = (R − min R) / (max R − min R)</w:t>
               <w:br/>
-              <w:t>IDPKI_norm  = (E − min E) / (max E − min E)</w:t>
+              <w:t>P_norm      = (P_ln − min P_ln) / (max P_ln − min P_ln)</w:t>
               <w:br/>
               <w:br/>
-              <w:t>senjang = risiko_norm − IDPKI_norm</w:t>
+              <w:t>senjang = risiko_norm − P_norm</w:t>
             </w:r>
           </w:p>
         </w:tc>

</xml_diff>

<commit_message>
Add Historis bubbles, Pusat map, and 2x2 Respons matching
</commit_message>
<xml_diff>
--- a/docs/Metodologi-PKPRB.docx
+++ b/docs/Metodologi-PKPRB.docx
@@ -361,6 +361,84 @@
           <w:sz w:val="22"/>
         </w:rPr>
         <w:t xml:space="preserve"> — matriks 3×3 tertil risiko × tertil pendidikan di antara 38 provinsi. Tidak dipaksa jadi satu angka. Tooltip memakai kedua nilai 1–10.</w:t>
+      </w:r>
+    </w:p>
+    <w:p>
+      <w:pPr>
+        <w:pStyle w:val="ListNumber"/>
+        <w:spacing w:after="80" w:before="0" w:line="276" w:lineRule="auto"/>
+      </w:pPr>
+      <w:r>
+        <w:rPr>
+          <w:rFonts w:ascii="Calibri" w:hAnsi="Calibri" w:eastAsia="Calibri"/>
+          <w:b/>
+          <w:i w:val="0"/>
+          <w:color w:val="1F1A16"/>
+          <w:sz w:val="22"/>
+        </w:rPr>
+        <w:t>Historis</w:t>
+      </w:r>
+      <w:r>
+        <w:rPr>
+          <w:rFonts w:ascii="Calibri" w:hAnsi="Calibri" w:eastAsia="Calibri"/>
+          <w:b w:val="0"/>
+          <w:i w:val="0"/>
+          <w:color w:val="1F1A16"/>
+          <w:sz w:val="22"/>
+        </w:rPr>
+        <w:t xml:space="preserve"> — bubble korban jiwa kejadian signifikan sejak 2000 (kurasi, bukan DIBI lengkap).</w:t>
+      </w:r>
+    </w:p>
+    <w:p>
+      <w:pPr>
+        <w:pStyle w:val="ListNumber"/>
+        <w:spacing w:after="80" w:before="0" w:line="276" w:lineRule="auto"/>
+      </w:pPr>
+      <w:r>
+        <w:rPr>
+          <w:rFonts w:ascii="Calibri" w:hAnsi="Calibri" w:eastAsia="Calibri"/>
+          <w:b/>
+          <w:i w:val="0"/>
+          <w:color w:val="1F1A16"/>
+          <w:sz w:val="22"/>
+        </w:rPr>
+        <w:t>Pusat</w:t>
+      </w:r>
+      <w:r>
+        <w:rPr>
+          <w:rFonts w:ascii="Calibri" w:hAnsi="Calibri" w:eastAsia="Calibri"/>
+          <w:b w:val="0"/>
+          <w:i w:val="0"/>
+          <w:color w:val="1F1A16"/>
+          <w:sz w:val="22"/>
+        </w:rPr>
+        <w:t xml:space="preserve"> — massa pusat studi + PkM di provinsi itu (tanpa prodi, tanpa spillover). Skala 1–10.</w:t>
+      </w:r>
+    </w:p>
+    <w:p>
+      <w:pPr>
+        <w:pStyle w:val="ListNumber"/>
+        <w:spacing w:after="80" w:before="0" w:line="276" w:lineRule="auto"/>
+      </w:pPr>
+      <w:r>
+        <w:rPr>
+          <w:rFonts w:ascii="Calibri" w:hAnsi="Calibri" w:eastAsia="Calibri"/>
+          <w:b/>
+          <w:i w:val="0"/>
+          <w:color w:val="1F1A16"/>
+          <w:sz w:val="22"/>
+        </w:rPr>
+        <w:t>Respons</w:t>
+      </w:r>
+      <w:r>
+        <w:rPr>
+          <w:rFonts w:ascii="Calibri" w:hAnsi="Calibri" w:eastAsia="Calibri"/>
+          <w:b w:val="0"/>
+          <w:i w:val="0"/>
+          <w:color w:val="1F1A16"/>
+          <w:sz w:val="22"/>
+        </w:rPr>
+        <w:t xml:space="preserve"> — matriks 2×2 historis × pusat. Belum terespons + risiko tinggi = celah roadmap.</w:t>
       </w:r>
     </w:p>
     <w:p>
@@ -6312,6 +6390,662 @@
           <w:rFonts w:ascii="Cambria" w:hAnsi="Cambria" w:eastAsia="Cambria"/>
           <w:color w:val="1F1A16"/>
         </w:rPr>
+        <w:t>10. Historis, pusat, dan respons</w:t>
+      </w:r>
+    </w:p>
+    <w:p>
+      <w:pPr>
+        <w:spacing w:after="160" w:before="0" w:line="276" w:lineRule="auto"/>
+      </w:pPr>
+      <w:r>
+        <w:rPr>
+          <w:rFonts w:ascii="Calibri" w:hAnsi="Calibri" w:eastAsia="Calibri"/>
+          <w:b w:val="0"/>
+          <w:i w:val="0"/>
+          <w:color w:val="1F1A16"/>
+          <w:sz w:val="22"/>
+        </w:rPr>
+        <w:t>Tiga tampilan ini memilah penelitian/PkM yang mengikuti luka dari yang mendahului kejadian — bahan roadmap riset, bukan preparedness. Prodi tetap di Pendidikan/Keselarasan. Pusat di peta Respons = stok lokal (spillover tidak dihitung).</w:t>
+      </w:r>
+    </w:p>
+    <w:p>
+      <w:pPr>
+        <w:spacing w:after="160" w:before="0" w:line="276" w:lineRule="auto"/>
+      </w:pPr>
+      <w:r>
+        <w:rPr>
+          <w:rFonts w:ascii="Calibri" w:hAnsi="Calibri" w:eastAsia="Calibri"/>
+          <w:b w:val="0"/>
+          <w:i w:val="0"/>
+          <w:color w:val="1F1A16"/>
+          <w:sz w:val="22"/>
+        </w:rPr>
+        <w:t>Historis: korban jiwa kejadian signifikan 2000–kini, kurasi publik (bukan DIBI lengkap). Satu peristiwa dihitung sekali pada komposit; pada bahaya tunggal jika tercantum di daftar bahayanya. Karhutla understated (korban langsung, bukan excess death haze).</w:t>
+      </w:r>
+    </w:p>
+    <w:tbl>
+      <w:tblPr>
+        <w:tblW w:type="auto" w:w="0"/>
+        <w:tblLayout w:type="autofit"/>
+        <w:tblLook w:firstColumn="1" w:firstRow="1" w:lastColumn="0" w:lastRow="0" w:noHBand="0" w:noVBand="1" w:val="04A0"/>
+      </w:tblPr>
+      <w:tblGrid>
+        <w:gridCol w:w="9412"/>
+      </w:tblGrid>
+      <w:tr>
+        <w:tc>
+          <w:tcPr>
+            <w:tcW w:type="dxa" w:w="9412"/>
+            <w:shd w:fill="EDE7DC" w:val="clear"/>
+            <w:tcBorders>
+              <w:top w:val="single" w:sz="4" w:space="0" w:color="C9C0B3"/>
+              <w:left w:val="single" w:sz="4" w:space="0" w:color="C9C0B3"/>
+              <w:bottom w:val="single" w:sz="4" w:space="0" w:color="C9C0B3"/>
+              <w:right w:val="single" w:sz="4" w:space="0" w:color="C9C0B3"/>
+            </w:tcBorders>
+          </w:tcPr>
+          <w:p>
+            <w:pPr>
+              <w:spacing w:after="0" w:before="0" w:line="276" w:lineRule="auto"/>
+            </w:pPr>
+            <w:r>
+              <w:rPr>
+                <w:rFonts w:ascii="Consolas" w:hAnsi="Consolas" w:eastAsia="Consolas"/>
+                <w:b w:val="0"/>
+                <w:i w:val="0"/>
+                <w:color w:val="1F1A16"/>
+                <w:sz w:val="20"/>
+              </w:rPr>
+              <w:t>kelas_historis = 1 jika korban &gt; median 38 provinsi, else 0</w:t>
+              <w:br/>
+              <w:t>kelas_pusat    = 1 jika (R_pusat + K_kepakaran)_lokal &gt; median, else 0</w:t>
+            </w:r>
+          </w:p>
+        </w:tc>
+      </w:tr>
+    </w:tbl>
+    <w:p/>
+    <w:tbl>
+      <w:tblPr>
+        <w:tblW w:type="auto" w:w="0"/>
+        <w:tblLayout w:type="autofit"/>
+        <w:tblLook w:firstColumn="1" w:firstRow="1" w:lastColumn="0" w:lastRow="0" w:noHBand="0" w:noVBand="1" w:val="04A0"/>
+      </w:tblPr>
+      <w:tblGrid>
+        <w:gridCol w:w="2353"/>
+        <w:gridCol w:w="2353"/>
+        <w:gridCol w:w="2353"/>
+        <w:gridCol w:w="2353"/>
+      </w:tblGrid>
+      <w:tr>
+        <w:tc>
+          <w:tcPr>
+            <w:tcW w:type="dxa" w:w="2353"/>
+            <w:shd w:fill="1F1A16" w:val="clear"/>
+            <w:tcBorders>
+              <w:top w:val="single" w:sz="4" w:space="0" w:color="1F1A16"/>
+              <w:left w:val="single" w:sz="4" w:space="0" w:color="1F1A16"/>
+              <w:bottom w:val="single" w:sz="4" w:space="0" w:color="1F1A16"/>
+              <w:right w:val="single" w:sz="4" w:space="0" w:color="1F1A16"/>
+            </w:tcBorders>
+          </w:tcPr>
+          <w:p>
+            <w:pPr>
+              <w:spacing w:after="0" w:before="0" w:line="276" w:lineRule="auto"/>
+            </w:pPr>
+            <w:r>
+              <w:rPr>
+                <w:rFonts w:ascii="Calibri" w:hAnsi="Calibri" w:eastAsia="Calibri"/>
+                <w:b/>
+                <w:i w:val="0"/>
+                <w:color w:val="F3EEE4"/>
+                <w:sz w:val="18"/>
+              </w:rPr>
+              <w:t>Historis</w:t>
+            </w:r>
+          </w:p>
+        </w:tc>
+        <w:tc>
+          <w:tcPr>
+            <w:tcW w:type="dxa" w:w="2353"/>
+            <w:shd w:fill="1F1A16" w:val="clear"/>
+            <w:tcBorders>
+              <w:top w:val="single" w:sz="4" w:space="0" w:color="1F1A16"/>
+              <w:left w:val="single" w:sz="4" w:space="0" w:color="1F1A16"/>
+              <w:bottom w:val="single" w:sz="4" w:space="0" w:color="1F1A16"/>
+              <w:right w:val="single" w:sz="4" w:space="0" w:color="1F1A16"/>
+            </w:tcBorders>
+          </w:tcPr>
+          <w:p>
+            <w:pPr>
+              <w:spacing w:after="0" w:before="0" w:line="276" w:lineRule="auto"/>
+            </w:pPr>
+            <w:r>
+              <w:rPr>
+                <w:rFonts w:ascii="Calibri" w:hAnsi="Calibri" w:eastAsia="Calibri"/>
+                <w:b/>
+                <w:i w:val="0"/>
+                <w:color w:val="F3EEE4"/>
+                <w:sz w:val="18"/>
+              </w:rPr>
+              <w:t>Pusat</w:t>
+            </w:r>
+          </w:p>
+        </w:tc>
+        <w:tc>
+          <w:tcPr>
+            <w:tcW w:type="dxa" w:w="2353"/>
+            <w:shd w:fill="1F1A16" w:val="clear"/>
+            <w:tcBorders>
+              <w:top w:val="single" w:sz="4" w:space="0" w:color="1F1A16"/>
+              <w:left w:val="single" w:sz="4" w:space="0" w:color="1F1A16"/>
+              <w:bottom w:val="single" w:sz="4" w:space="0" w:color="1F1A16"/>
+              <w:right w:val="single" w:sz="4" w:space="0" w:color="1F1A16"/>
+            </w:tcBorders>
+          </w:tcPr>
+          <w:p>
+            <w:pPr>
+              <w:spacing w:after="0" w:before="0" w:line="276" w:lineRule="auto"/>
+            </w:pPr>
+            <w:r>
+              <w:rPr>
+                <w:rFonts w:ascii="Calibri" w:hAnsi="Calibri" w:eastAsia="Calibri"/>
+                <w:b/>
+                <w:i w:val="0"/>
+                <w:color w:val="F3EEE4"/>
+                <w:sz w:val="18"/>
+              </w:rPr>
+              <w:t>Kuadran</w:t>
+            </w:r>
+          </w:p>
+        </w:tc>
+        <w:tc>
+          <w:tcPr>
+            <w:tcW w:type="dxa" w:w="2353"/>
+            <w:shd w:fill="1F1A16" w:val="clear"/>
+            <w:tcBorders>
+              <w:top w:val="single" w:sz="4" w:space="0" w:color="1F1A16"/>
+              <w:left w:val="single" w:sz="4" w:space="0" w:color="1F1A16"/>
+              <w:bottom w:val="single" w:sz="4" w:space="0" w:color="1F1A16"/>
+              <w:right w:val="single" w:sz="4" w:space="0" w:color="1F1A16"/>
+            </w:tcBorders>
+          </w:tcPr>
+          <w:p>
+            <w:pPr>
+              <w:spacing w:after="0" w:before="0" w:line="276" w:lineRule="auto"/>
+            </w:pPr>
+            <w:r>
+              <w:rPr>
+                <w:rFonts w:ascii="Calibri" w:hAnsi="Calibri" w:eastAsia="Calibri"/>
+                <w:b/>
+                <w:i w:val="0"/>
+                <w:color w:val="F3EEE4"/>
+                <w:sz w:val="18"/>
+              </w:rPr>
+              <w:t>Arti</w:t>
+            </w:r>
+          </w:p>
+        </w:tc>
+      </w:tr>
+      <w:tr>
+        <w:tc>
+          <w:tcPr>
+            <w:tcW w:type="dxa" w:w="2353"/>
+            <w:tcBorders>
+              <w:top w:val="single" w:sz="4" w:space="0" w:color="D9D1C5"/>
+              <w:left w:val="single" w:sz="4" w:space="0" w:color="D9D1C5"/>
+              <w:bottom w:val="single" w:sz="4" w:space="0" w:color="D9D1C5"/>
+              <w:right w:val="single" w:sz="4" w:space="0" w:color="D9D1C5"/>
+            </w:tcBorders>
+          </w:tcPr>
+          <w:p>
+            <w:pPr>
+              <w:spacing w:after="0" w:before="0" w:line="276" w:lineRule="auto"/>
+            </w:pPr>
+            <w:r>
+              <w:rPr>
+                <w:rFonts w:ascii="Calibri" w:hAnsi="Calibri" w:eastAsia="Calibri"/>
+                <w:b w:val="0"/>
+                <w:i w:val="0"/>
+                <w:color w:val="1F1A16"/>
+                <w:sz w:val="18"/>
+              </w:rPr>
+              <w:t>tinggi</w:t>
+            </w:r>
+          </w:p>
+        </w:tc>
+        <w:tc>
+          <w:tcPr>
+            <w:tcW w:type="dxa" w:w="2353"/>
+            <w:tcBorders>
+              <w:top w:val="single" w:sz="4" w:space="0" w:color="D9D1C5"/>
+              <w:left w:val="single" w:sz="4" w:space="0" w:color="D9D1C5"/>
+              <w:bottom w:val="single" w:sz="4" w:space="0" w:color="D9D1C5"/>
+              <w:right w:val="single" w:sz="4" w:space="0" w:color="D9D1C5"/>
+            </w:tcBorders>
+          </w:tcPr>
+          <w:p>
+            <w:pPr>
+              <w:spacing w:after="0" w:before="0" w:line="276" w:lineRule="auto"/>
+            </w:pPr>
+            <w:r>
+              <w:rPr>
+                <w:rFonts w:ascii="Calibri" w:hAnsi="Calibri" w:eastAsia="Calibri"/>
+                <w:b w:val="0"/>
+                <w:i w:val="0"/>
+                <w:color w:val="1F1A16"/>
+                <w:sz w:val="18"/>
+              </w:rPr>
+              <w:t>tinggi</w:t>
+            </w:r>
+          </w:p>
+        </w:tc>
+        <w:tc>
+          <w:tcPr>
+            <w:tcW w:type="dxa" w:w="2353"/>
+            <w:tcBorders>
+              <w:top w:val="single" w:sz="4" w:space="0" w:color="D9D1C5"/>
+              <w:left w:val="single" w:sz="4" w:space="0" w:color="D9D1C5"/>
+              <w:bottom w:val="single" w:sz="4" w:space="0" w:color="D9D1C5"/>
+              <w:right w:val="single" w:sz="4" w:space="0" w:color="D9D1C5"/>
+            </w:tcBorders>
+          </w:tcPr>
+          <w:p>
+            <w:pPr>
+              <w:spacing w:after="0" w:before="0" w:line="276" w:lineRule="auto"/>
+            </w:pPr>
+            <w:r>
+              <w:rPr>
+                <w:rFonts w:ascii="Calibri" w:hAnsi="Calibri" w:eastAsia="Calibri"/>
+                <w:b w:val="0"/>
+                <w:i w:val="0"/>
+                <w:color w:val="1F1A16"/>
+                <w:sz w:val="18"/>
+              </w:rPr>
+              <w:t>Responsif</w:t>
+            </w:r>
+          </w:p>
+        </w:tc>
+        <w:tc>
+          <w:tcPr>
+            <w:tcW w:type="dxa" w:w="2353"/>
+            <w:tcBorders>
+              <w:top w:val="single" w:sz="4" w:space="0" w:color="D9D1C5"/>
+              <w:left w:val="single" w:sz="4" w:space="0" w:color="D9D1C5"/>
+              <w:bottom w:val="single" w:sz="4" w:space="0" w:color="D9D1C5"/>
+              <w:right w:val="single" w:sz="4" w:space="0" w:color="D9D1C5"/>
+            </w:tcBorders>
+          </w:tcPr>
+          <w:p>
+            <w:pPr>
+              <w:spacing w:after="0" w:before="0" w:line="276" w:lineRule="auto"/>
+            </w:pPr>
+            <w:r>
+              <w:rPr>
+                <w:rFonts w:ascii="Calibri" w:hAnsi="Calibri" w:eastAsia="Calibri"/>
+                <w:b w:val="0"/>
+                <w:i w:val="0"/>
+                <w:color w:val="1F1A16"/>
+                <w:sz w:val="18"/>
+              </w:rPr>
+              <w:t>Kapasitas setelah peristiwa (TDMRC, PSBA, Nalodo)</w:t>
+            </w:r>
+          </w:p>
+        </w:tc>
+      </w:tr>
+      <w:tr>
+        <w:tc>
+          <w:tcPr>
+            <w:tcW w:type="dxa" w:w="2353"/>
+            <w:shd w:fill="F7F3EC" w:val="clear"/>
+            <w:tcBorders>
+              <w:top w:val="single" w:sz="4" w:space="0" w:color="D9D1C5"/>
+              <w:left w:val="single" w:sz="4" w:space="0" w:color="D9D1C5"/>
+              <w:bottom w:val="single" w:sz="4" w:space="0" w:color="D9D1C5"/>
+              <w:right w:val="single" w:sz="4" w:space="0" w:color="D9D1C5"/>
+            </w:tcBorders>
+          </w:tcPr>
+          <w:p>
+            <w:pPr>
+              <w:spacing w:after="0" w:before="0" w:line="276" w:lineRule="auto"/>
+            </w:pPr>
+            <w:r>
+              <w:rPr>
+                <w:rFonts w:ascii="Calibri" w:hAnsi="Calibri" w:eastAsia="Calibri"/>
+                <w:b w:val="0"/>
+                <w:i w:val="0"/>
+                <w:color w:val="1F1A16"/>
+                <w:sz w:val="18"/>
+              </w:rPr>
+              <w:t>rendah</w:t>
+            </w:r>
+          </w:p>
+        </w:tc>
+        <w:tc>
+          <w:tcPr>
+            <w:tcW w:type="dxa" w:w="2353"/>
+            <w:shd w:fill="F7F3EC" w:val="clear"/>
+            <w:tcBorders>
+              <w:top w:val="single" w:sz="4" w:space="0" w:color="D9D1C5"/>
+              <w:left w:val="single" w:sz="4" w:space="0" w:color="D9D1C5"/>
+              <w:bottom w:val="single" w:sz="4" w:space="0" w:color="D9D1C5"/>
+              <w:right w:val="single" w:sz="4" w:space="0" w:color="D9D1C5"/>
+            </w:tcBorders>
+          </w:tcPr>
+          <w:p>
+            <w:pPr>
+              <w:spacing w:after="0" w:before="0" w:line="276" w:lineRule="auto"/>
+            </w:pPr>
+            <w:r>
+              <w:rPr>
+                <w:rFonts w:ascii="Calibri" w:hAnsi="Calibri" w:eastAsia="Calibri"/>
+                <w:b w:val="0"/>
+                <w:i w:val="0"/>
+                <w:color w:val="1F1A16"/>
+                <w:sz w:val="18"/>
+              </w:rPr>
+              <w:t>tinggi</w:t>
+            </w:r>
+          </w:p>
+        </w:tc>
+        <w:tc>
+          <w:tcPr>
+            <w:tcW w:type="dxa" w:w="2353"/>
+            <w:shd w:fill="F7F3EC" w:val="clear"/>
+            <w:tcBorders>
+              <w:top w:val="single" w:sz="4" w:space="0" w:color="D9D1C5"/>
+              <w:left w:val="single" w:sz="4" w:space="0" w:color="D9D1C5"/>
+              <w:bottom w:val="single" w:sz="4" w:space="0" w:color="D9D1C5"/>
+              <w:right w:val="single" w:sz="4" w:space="0" w:color="D9D1C5"/>
+            </w:tcBorders>
+          </w:tcPr>
+          <w:p>
+            <w:pPr>
+              <w:spacing w:after="0" w:before="0" w:line="276" w:lineRule="auto"/>
+            </w:pPr>
+            <w:r>
+              <w:rPr>
+                <w:rFonts w:ascii="Calibri" w:hAnsi="Calibri" w:eastAsia="Calibri"/>
+                <w:b w:val="0"/>
+                <w:i w:val="0"/>
+                <w:color w:val="1F1A16"/>
+                <w:sz w:val="18"/>
+              </w:rPr>
+              <w:t>Antisipatif</w:t>
+            </w:r>
+          </w:p>
+        </w:tc>
+        <w:tc>
+          <w:tcPr>
+            <w:tcW w:type="dxa" w:w="2353"/>
+            <w:shd w:fill="F7F3EC" w:val="clear"/>
+            <w:tcBorders>
+              <w:top w:val="single" w:sz="4" w:space="0" w:color="D9D1C5"/>
+              <w:left w:val="single" w:sz="4" w:space="0" w:color="D9D1C5"/>
+              <w:bottom w:val="single" w:sz="4" w:space="0" w:color="D9D1C5"/>
+              <w:right w:val="single" w:sz="4" w:space="0" w:color="D9D1C5"/>
+            </w:tcBorders>
+          </w:tcPr>
+          <w:p>
+            <w:pPr>
+              <w:spacing w:after="0" w:before="0" w:line="276" w:lineRule="auto"/>
+            </w:pPr>
+            <w:r>
+              <w:rPr>
+                <w:rFonts w:ascii="Calibri" w:hAnsi="Calibri" w:eastAsia="Calibri"/>
+                <w:b w:val="0"/>
+                <w:i w:val="0"/>
+                <w:color w:val="1F1A16"/>
+                <w:sz w:val="18"/>
+              </w:rPr>
+              <w:t>Pusat tanpa pemicu lokal — yang ingin ditiru</w:t>
+            </w:r>
+          </w:p>
+        </w:tc>
+      </w:tr>
+      <w:tr>
+        <w:tc>
+          <w:tcPr>
+            <w:tcW w:type="dxa" w:w="2353"/>
+            <w:tcBorders>
+              <w:top w:val="single" w:sz="4" w:space="0" w:color="D9D1C5"/>
+              <w:left w:val="single" w:sz="4" w:space="0" w:color="D9D1C5"/>
+              <w:bottom w:val="single" w:sz="4" w:space="0" w:color="D9D1C5"/>
+              <w:right w:val="single" w:sz="4" w:space="0" w:color="D9D1C5"/>
+            </w:tcBorders>
+          </w:tcPr>
+          <w:p>
+            <w:pPr>
+              <w:spacing w:after="0" w:before="0" w:line="276" w:lineRule="auto"/>
+            </w:pPr>
+            <w:r>
+              <w:rPr>
+                <w:rFonts w:ascii="Calibri" w:hAnsi="Calibri" w:eastAsia="Calibri"/>
+                <w:b w:val="0"/>
+                <w:i w:val="0"/>
+                <w:color w:val="1F1A16"/>
+                <w:sz w:val="18"/>
+              </w:rPr>
+              <w:t>tinggi</w:t>
+            </w:r>
+          </w:p>
+        </w:tc>
+        <w:tc>
+          <w:tcPr>
+            <w:tcW w:type="dxa" w:w="2353"/>
+            <w:tcBorders>
+              <w:top w:val="single" w:sz="4" w:space="0" w:color="D9D1C5"/>
+              <w:left w:val="single" w:sz="4" w:space="0" w:color="D9D1C5"/>
+              <w:bottom w:val="single" w:sz="4" w:space="0" w:color="D9D1C5"/>
+              <w:right w:val="single" w:sz="4" w:space="0" w:color="D9D1C5"/>
+            </w:tcBorders>
+          </w:tcPr>
+          <w:p>
+            <w:pPr>
+              <w:spacing w:after="0" w:before="0" w:line="276" w:lineRule="auto"/>
+            </w:pPr>
+            <w:r>
+              <w:rPr>
+                <w:rFonts w:ascii="Calibri" w:hAnsi="Calibri" w:eastAsia="Calibri"/>
+                <w:b w:val="0"/>
+                <w:i w:val="0"/>
+                <w:color w:val="1F1A16"/>
+                <w:sz w:val="18"/>
+              </w:rPr>
+              <w:t>rendah</w:t>
+            </w:r>
+          </w:p>
+        </w:tc>
+        <w:tc>
+          <w:tcPr>
+            <w:tcW w:type="dxa" w:w="2353"/>
+            <w:tcBorders>
+              <w:top w:val="single" w:sz="4" w:space="0" w:color="D9D1C5"/>
+              <w:left w:val="single" w:sz="4" w:space="0" w:color="D9D1C5"/>
+              <w:bottom w:val="single" w:sz="4" w:space="0" w:color="D9D1C5"/>
+              <w:right w:val="single" w:sz="4" w:space="0" w:color="D9D1C5"/>
+            </w:tcBorders>
+          </w:tcPr>
+          <w:p>
+            <w:pPr>
+              <w:spacing w:after="0" w:before="0" w:line="276" w:lineRule="auto"/>
+            </w:pPr>
+            <w:r>
+              <w:rPr>
+                <w:rFonts w:ascii="Calibri" w:hAnsi="Calibri" w:eastAsia="Calibri"/>
+                <w:b w:val="0"/>
+                <w:i w:val="0"/>
+                <w:color w:val="1F1A16"/>
+                <w:sz w:val="18"/>
+              </w:rPr>
+              <w:t>Tidak melembaga</w:t>
+            </w:r>
+          </w:p>
+        </w:tc>
+        <w:tc>
+          <w:tcPr>
+            <w:tcW w:type="dxa" w:w="2353"/>
+            <w:tcBorders>
+              <w:top w:val="single" w:sz="4" w:space="0" w:color="D9D1C5"/>
+              <w:left w:val="single" w:sz="4" w:space="0" w:color="D9D1C5"/>
+              <w:bottom w:val="single" w:sz="4" w:space="0" w:color="D9D1C5"/>
+              <w:right w:val="single" w:sz="4" w:space="0" w:color="D9D1C5"/>
+            </w:tcBorders>
+          </w:tcPr>
+          <w:p>
+            <w:pPr>
+              <w:spacing w:after="0" w:before="0" w:line="276" w:lineRule="auto"/>
+            </w:pPr>
+            <w:r>
+              <w:rPr>
+                <w:rFonts w:ascii="Calibri" w:hAnsi="Calibri" w:eastAsia="Calibri"/>
+                <w:b w:val="0"/>
+                <w:i w:val="0"/>
+                <w:color w:val="1F1A16"/>
+                <w:sz w:val="18"/>
+              </w:rPr>
+              <w:t>Terjadi, kelembagaan tidak menempel</w:t>
+            </w:r>
+          </w:p>
+        </w:tc>
+      </w:tr>
+      <w:tr>
+        <w:tc>
+          <w:tcPr>
+            <w:tcW w:type="dxa" w:w="2353"/>
+            <w:shd w:fill="F7F3EC" w:val="clear"/>
+            <w:tcBorders>
+              <w:top w:val="single" w:sz="4" w:space="0" w:color="D9D1C5"/>
+              <w:left w:val="single" w:sz="4" w:space="0" w:color="D9D1C5"/>
+              <w:bottom w:val="single" w:sz="4" w:space="0" w:color="D9D1C5"/>
+              <w:right w:val="single" w:sz="4" w:space="0" w:color="D9D1C5"/>
+            </w:tcBorders>
+          </w:tcPr>
+          <w:p>
+            <w:pPr>
+              <w:spacing w:after="0" w:before="0" w:line="276" w:lineRule="auto"/>
+            </w:pPr>
+            <w:r>
+              <w:rPr>
+                <w:rFonts w:ascii="Calibri" w:hAnsi="Calibri" w:eastAsia="Calibri"/>
+                <w:b w:val="0"/>
+                <w:i w:val="0"/>
+                <w:color w:val="1F1A16"/>
+                <w:sz w:val="18"/>
+              </w:rPr>
+              <w:t>rendah</w:t>
+            </w:r>
+          </w:p>
+        </w:tc>
+        <w:tc>
+          <w:tcPr>
+            <w:tcW w:type="dxa" w:w="2353"/>
+            <w:shd w:fill="F7F3EC" w:val="clear"/>
+            <w:tcBorders>
+              <w:top w:val="single" w:sz="4" w:space="0" w:color="D9D1C5"/>
+              <w:left w:val="single" w:sz="4" w:space="0" w:color="D9D1C5"/>
+              <w:bottom w:val="single" w:sz="4" w:space="0" w:color="D9D1C5"/>
+              <w:right w:val="single" w:sz="4" w:space="0" w:color="D9D1C5"/>
+            </w:tcBorders>
+          </w:tcPr>
+          <w:p>
+            <w:pPr>
+              <w:spacing w:after="0" w:before="0" w:line="276" w:lineRule="auto"/>
+            </w:pPr>
+            <w:r>
+              <w:rPr>
+                <w:rFonts w:ascii="Calibri" w:hAnsi="Calibri" w:eastAsia="Calibri"/>
+                <w:b w:val="0"/>
+                <w:i w:val="0"/>
+                <w:color w:val="1F1A16"/>
+                <w:sz w:val="18"/>
+              </w:rPr>
+              <w:t>rendah</w:t>
+            </w:r>
+          </w:p>
+        </w:tc>
+        <w:tc>
+          <w:tcPr>
+            <w:tcW w:type="dxa" w:w="2353"/>
+            <w:shd w:fill="F7F3EC" w:val="clear"/>
+            <w:tcBorders>
+              <w:top w:val="single" w:sz="4" w:space="0" w:color="D9D1C5"/>
+              <w:left w:val="single" w:sz="4" w:space="0" w:color="D9D1C5"/>
+              <w:bottom w:val="single" w:sz="4" w:space="0" w:color="D9D1C5"/>
+              <w:right w:val="single" w:sz="4" w:space="0" w:color="D9D1C5"/>
+            </w:tcBorders>
+          </w:tcPr>
+          <w:p>
+            <w:pPr>
+              <w:spacing w:after="0" w:before="0" w:line="276" w:lineRule="auto"/>
+            </w:pPr>
+            <w:r>
+              <w:rPr>
+                <w:rFonts w:ascii="Calibri" w:hAnsi="Calibri" w:eastAsia="Calibri"/>
+                <w:b w:val="0"/>
+                <w:i w:val="0"/>
+                <w:color w:val="1F1A16"/>
+                <w:sz w:val="18"/>
+              </w:rPr>
+              <w:t>Belum terespons</w:t>
+            </w:r>
+          </w:p>
+        </w:tc>
+        <w:tc>
+          <w:tcPr>
+            <w:tcW w:type="dxa" w:w="2353"/>
+            <w:shd w:fill="F7F3EC" w:val="clear"/>
+            <w:tcBorders>
+              <w:top w:val="single" w:sz="4" w:space="0" w:color="D9D1C5"/>
+              <w:left w:val="single" w:sz="4" w:space="0" w:color="D9D1C5"/>
+              <w:bottom w:val="single" w:sz="4" w:space="0" w:color="D9D1C5"/>
+              <w:right w:val="single" w:sz="4" w:space="0" w:color="D9D1C5"/>
+            </w:tcBorders>
+          </w:tcPr>
+          <w:p>
+            <w:pPr>
+              <w:spacing w:after="0" w:before="0" w:line="276" w:lineRule="auto"/>
+            </w:pPr>
+            <w:r>
+              <w:rPr>
+                <w:rFonts w:ascii="Calibri" w:hAnsi="Calibri" w:eastAsia="Calibri"/>
+                <w:b w:val="0"/>
+                <w:i w:val="0"/>
+                <w:color w:val="1F1A16"/>
+                <w:sz w:val="18"/>
+              </w:rPr>
+              <w:t>Jika risiko tinggi: celah roadmap</w:t>
+            </w:r>
+          </w:p>
+        </w:tc>
+      </w:tr>
+    </w:tbl>
+    <w:p/>
+    <w:p>
+      <w:pPr>
+        <w:spacing w:after="160" w:before="0" w:line="276" w:lineRule="auto"/>
+      </w:pPr>
+      <w:r>
+        <w:rPr>
+          <w:rFonts w:ascii="Calibri" w:hAnsi="Calibri" w:eastAsia="Calibri"/>
+          <w:b w:val="0"/>
+          <w:i w:val="0"/>
+          <w:color w:val="1F1A16"/>
+          <w:sz w:val="22"/>
+        </w:rPr>
+        <w:t>Footer pada tab Respons mengurutkan “belum terespons + risiko tinggi”. Ini bukan peta kesiapan; ini daftar wilayah yang risikonya tinggi, memorinya kosong, dan pusatnya belum ada.</w:t>
+      </w:r>
+    </w:p>
+    <w:p>
+      <w:pPr>
+        <w:pStyle w:val="Heading1"/>
+        <w:spacing w:after="160" w:before="320" w:line="276" w:lineRule="auto"/>
+      </w:pPr>
+      <w:r>
+        <w:rPr>
+          <w:rFonts w:ascii="Cambria" w:hAnsi="Cambria" w:eastAsia="Cambria"/>
+          <w:color w:val="1F1A16"/>
+        </w:rPr>
         <w:t>Sumber data prototipe</w:t>
       </w:r>
     </w:p>
@@ -6409,6 +7143,22 @@
           <w:sz w:val="22"/>
         </w:rPr>
         <w:t>Penduduk: angka prototipe, 38 provinsi termasuk pemekaran Papua.</w:t>
+      </w:r>
+    </w:p>
+    <w:p>
+      <w:pPr>
+        <w:pStyle w:val="ListBullet"/>
+        <w:spacing w:after="80" w:before="0" w:line="276" w:lineRule="auto"/>
+      </w:pPr>
+      <w:r>
+        <w:rPr>
+          <w:rFonts w:ascii="Calibri" w:hAnsi="Calibri" w:eastAsia="Calibri"/>
+          <w:b w:val="0"/>
+          <w:i w:val="0"/>
+          <w:color w:val="1F1A16"/>
+          <w:sz w:val="22"/>
+        </w:rPr>
+        <w:t>Katalog 45 kejadian signifikan 2000–2024 (korban jiwa, kurasi BNPB/EM-DAT/laporan publik) — bukan unduhan DIBI.</w:t>
       </w:r>
     </w:p>
     <w:p>

</xml_diff>